<commit_message>
barlow/finesst: sync FI C&P FINESST entry to submitted budget (12/2029, $148,368)
Signed C&P disclosed 08/2029 / up-to-$133k from the pre-budget estimate;
actual UH budget is 3 full years / $148,368. Needs FI re-signature.

Co-Authored-By: Claude Fable 5 <noreply@anthropic.com>
</commit_message>
<xml_diff>
--- a/barlow/finesst_final/current_pending_FI_goodrich.docx
+++ b/barlow/finesst_final/current_pending_FI_goodrich.docx
@@ -395,7 +395,7 @@
         <w:t xml:space="preserve">Start Date: </w:t>
       </w:r>
       <w:r>
-        <w:t>01/2027    End Date: 08/2029 (2 years, 8 months)</w:t>
+        <w:t xml:space="preserve">01/2027    End Date: 12/2029 (3 years)</w:t>
       </w:r>
       <w:r>
         <w:rPr>
@@ -415,7 +415,7 @@
         <w:t xml:space="preserve">Total Anticipated Amount: </w:t>
       </w:r>
       <w:r>
-        <w:t>up to $133,000 ($50,000 per budget year, final year partial)</w:t>
+        <w:t xml:space="preserve">up to $148,368 ($48,456 in year 1 and $49,956 in years 2 and 3, under the $50,000 annual cap)</w:t>
       </w:r>
     </w:p>
     <w:p>

</xml_diff>